<commit_message>
Modificación del apendice 1 con la estrategia de búsqueda adaptada para diferentes bases de datos.
</commit_message>
<xml_diff>
--- a/Appendix I_Search strategy (Ovid MEDLINE) – Unified version-17-10-26.docx
+++ b/Appendix I_Search strategy (Ovid MEDLINE) – Unified version-17-10-26.docx
@@ -21,7 +21,13 @@
         <w:t xml:space="preserve">. Date of search: </w:t>
       </w:r>
       <w:r>
-        <w:t>October 15, 2026</w:t>
+        <w:t>October 1</w:t>
+      </w:r>
+      <w:r>
+        <w:t>7</w:t>
+      </w:r>
+      <w:r>
+        <w:t>, 2026</w:t>
       </w:r>
       <w:r>
         <w:t>. Limits: none.</w:t>
@@ -142,39 +148,8 @@
                 <w:sz w:val="18"/>
                 <w:szCs w:val="18"/>
               </w:rPr>
-              <w:t xml:space="preserve">POBLACIÓN: </w:t>
+              <w:t>POBLACIÓN: registros de mortalidad</w:t>
             </w:r>
-            <w:proofErr w:type="spellStart"/>
-            <w:r>
-              <w:rPr>
-                <w:rFonts w:ascii="Consolas" w:hAnsi="Consolas"/>
-                <w:b/>
-                <w:sz w:val="18"/>
-                <w:szCs w:val="18"/>
-              </w:rPr>
-              <w:t>registros</w:t>
-            </w:r>
-            <w:proofErr w:type="spellEnd"/>
-            <w:r>
-              <w:rPr>
-                <w:rFonts w:ascii="Consolas" w:hAnsi="Consolas"/>
-                <w:b/>
-                <w:sz w:val="18"/>
-                <w:szCs w:val="18"/>
-              </w:rPr>
-              <w:t xml:space="preserve"> de </w:t>
-            </w:r>
-            <w:proofErr w:type="spellStart"/>
-            <w:r>
-              <w:rPr>
-                <w:rFonts w:ascii="Consolas" w:hAnsi="Consolas"/>
-                <w:b/>
-                <w:sz w:val="18"/>
-                <w:szCs w:val="18"/>
-              </w:rPr>
-              <w:t>mortalidad</w:t>
-            </w:r>
-            <w:proofErr w:type="spellEnd"/>
           </w:p>
         </w:tc>
       </w:tr>
@@ -506,107 +481,7 @@
                 <w:sz w:val="18"/>
                 <w:szCs w:val="18"/>
               </w:rPr>
-              <w:t xml:space="preserve">(vital statistics or vital statistics registration* or registration of vital statistics or vital registration or civil registration or CRVS or population register* or mortality </w:t>
-            </w:r>
-            <w:proofErr w:type="spellStart"/>
-            <w:r>
-              <w:rPr>
-                <w:rFonts w:ascii="Consolas" w:hAnsi="Consolas"/>
-                <w:sz w:val="18"/>
-                <w:szCs w:val="18"/>
-              </w:rPr>
-              <w:t>regist</w:t>
-            </w:r>
-            <w:proofErr w:type="spellEnd"/>
-            <w:r>
-              <w:rPr>
-                <w:rFonts w:ascii="Consolas" w:hAnsi="Consolas"/>
-                <w:sz w:val="18"/>
-                <w:szCs w:val="18"/>
-              </w:rPr>
-              <w:t xml:space="preserve">* or death </w:t>
-            </w:r>
-            <w:proofErr w:type="spellStart"/>
-            <w:r>
-              <w:rPr>
-                <w:rFonts w:ascii="Consolas" w:hAnsi="Consolas"/>
-                <w:sz w:val="18"/>
-                <w:szCs w:val="18"/>
-              </w:rPr>
-              <w:t>regist</w:t>
-            </w:r>
-            <w:proofErr w:type="spellEnd"/>
-            <w:r>
-              <w:rPr>
-                <w:rFonts w:ascii="Consolas" w:hAnsi="Consolas"/>
-                <w:sz w:val="18"/>
-                <w:szCs w:val="18"/>
-              </w:rPr>
-              <w:t xml:space="preserve">* or death </w:t>
-            </w:r>
-            <w:proofErr w:type="spellStart"/>
-            <w:r>
-              <w:rPr>
-                <w:rFonts w:ascii="Consolas" w:hAnsi="Consolas"/>
-                <w:sz w:val="18"/>
-                <w:szCs w:val="18"/>
-              </w:rPr>
-              <w:t>certificat</w:t>
-            </w:r>
-            <w:proofErr w:type="spellEnd"/>
-            <w:r>
-              <w:rPr>
-                <w:rFonts w:ascii="Consolas" w:hAnsi="Consolas"/>
-                <w:sz w:val="18"/>
-                <w:szCs w:val="18"/>
-              </w:rPr>
-              <w:t>* or death record* or cause of death or causes of death or death cause* or underlying cause* or mortality data or mortality statistic* or mortality record* or mortality information system* or mortality rate* or death rate*</w:t>
-            </w:r>
-            <w:proofErr w:type="gramStart"/>
-            <w:r>
-              <w:rPr>
-                <w:rFonts w:ascii="Consolas" w:hAnsi="Consolas"/>
-                <w:sz w:val="18"/>
-                <w:szCs w:val="18"/>
-              </w:rPr>
-              <w:t>).</w:t>
-            </w:r>
-            <w:proofErr w:type="spellStart"/>
-            <w:r>
-              <w:rPr>
-                <w:rFonts w:ascii="Consolas" w:hAnsi="Consolas"/>
-                <w:sz w:val="18"/>
-                <w:szCs w:val="18"/>
-              </w:rPr>
-              <w:t>ti</w:t>
-            </w:r>
-            <w:proofErr w:type="gramEnd"/>
-            <w:r>
-              <w:rPr>
-                <w:rFonts w:ascii="Consolas" w:hAnsi="Consolas"/>
-                <w:sz w:val="18"/>
-                <w:szCs w:val="18"/>
-              </w:rPr>
-              <w:t>,</w:t>
-            </w:r>
-            <w:proofErr w:type="gramStart"/>
-            <w:r>
-              <w:rPr>
-                <w:rFonts w:ascii="Consolas" w:hAnsi="Consolas"/>
-                <w:sz w:val="18"/>
-                <w:szCs w:val="18"/>
-              </w:rPr>
-              <w:t>ab,kf</w:t>
-            </w:r>
-            <w:proofErr w:type="spellEnd"/>
-            <w:proofErr w:type="gramEnd"/>
-            <w:r>
-              <w:rPr>
-                <w:rFonts w:ascii="Consolas" w:hAnsi="Consolas"/>
-                <w:sz w:val="18"/>
-                <w:szCs w:val="18"/>
-              </w:rPr>
-              <w:t>.</w:t>
+              <w:t>(vital statistics or vital statistics registration* or registration of vital statistics or vital registration or civil registration or CRVS or population register* or mortality regist* or death regist* or death certificat* or death record* or cause of death or causes of death or death cause* or underlying cause* or mortality data or mortality statistic* or mortality record* or mortality information system* or mortality rate* or death rate*).ti,ab,kf.</w:t>
             </w:r>
           </w:p>
         </w:tc>
@@ -677,53 +552,7 @@
                 <w:sz w:val="18"/>
                 <w:szCs w:val="18"/>
               </w:rPr>
-              <w:t>(population surveillance or public health surveillance or international classification of disease* or ICD-9 or ICD-10 or ICD-11 or clinical coding or medical coding or health information system*</w:t>
-            </w:r>
-            <w:proofErr w:type="gramStart"/>
-            <w:r>
-              <w:rPr>
-                <w:rFonts w:ascii="Consolas" w:hAnsi="Consolas"/>
-                <w:sz w:val="18"/>
-                <w:szCs w:val="18"/>
-              </w:rPr>
-              <w:t>).</w:t>
-            </w:r>
-            <w:proofErr w:type="spellStart"/>
-            <w:r>
-              <w:rPr>
-                <w:rFonts w:ascii="Consolas" w:hAnsi="Consolas"/>
-                <w:sz w:val="18"/>
-                <w:szCs w:val="18"/>
-              </w:rPr>
-              <w:t>ti</w:t>
-            </w:r>
-            <w:proofErr w:type="gramEnd"/>
-            <w:r>
-              <w:rPr>
-                <w:rFonts w:ascii="Consolas" w:hAnsi="Consolas"/>
-                <w:sz w:val="18"/>
-                <w:szCs w:val="18"/>
-              </w:rPr>
-              <w:t>,</w:t>
-            </w:r>
-            <w:proofErr w:type="gramStart"/>
-            <w:r>
-              <w:rPr>
-                <w:rFonts w:ascii="Consolas" w:hAnsi="Consolas"/>
-                <w:sz w:val="18"/>
-                <w:szCs w:val="18"/>
-              </w:rPr>
-              <w:t>ab,kf</w:t>
-            </w:r>
-            <w:proofErr w:type="spellEnd"/>
-            <w:proofErr w:type="gramEnd"/>
-            <w:r>
-              <w:rPr>
-                <w:rFonts w:ascii="Consolas" w:hAnsi="Consolas"/>
-                <w:sz w:val="18"/>
-                <w:szCs w:val="18"/>
-              </w:rPr>
-              <w:t>.</w:t>
+              <w:t>(population surveillance or public health surveillance or international classification of disease* or ICD-9 or ICD-10 or ICD-11 or clinical coding or medical coding or health information system*).ti,ab,kf.</w:t>
             </w:r>
           </w:p>
         </w:tc>
@@ -794,71 +623,7 @@
                 <w:sz w:val="18"/>
                 <w:szCs w:val="18"/>
               </w:rPr>
-              <w:t xml:space="preserve">(mortality or cause of death or death </w:t>
-            </w:r>
-            <w:proofErr w:type="spellStart"/>
-            <w:r>
-              <w:rPr>
-                <w:rFonts w:ascii="Consolas" w:hAnsi="Consolas"/>
-                <w:sz w:val="18"/>
-                <w:szCs w:val="18"/>
-              </w:rPr>
-              <w:t>certificat</w:t>
-            </w:r>
-            <w:proofErr w:type="spellEnd"/>
-            <w:r>
-              <w:rPr>
-                <w:rFonts w:ascii="Consolas" w:hAnsi="Consolas"/>
-                <w:sz w:val="18"/>
-                <w:szCs w:val="18"/>
-              </w:rPr>
-              <w:t>*</w:t>
-            </w:r>
-            <w:proofErr w:type="gramStart"/>
-            <w:r>
-              <w:rPr>
-                <w:rFonts w:ascii="Consolas" w:hAnsi="Consolas"/>
-                <w:sz w:val="18"/>
-                <w:szCs w:val="18"/>
-              </w:rPr>
-              <w:t>).</w:t>
-            </w:r>
-            <w:proofErr w:type="spellStart"/>
-            <w:r>
-              <w:rPr>
-                <w:rFonts w:ascii="Consolas" w:hAnsi="Consolas"/>
-                <w:sz w:val="18"/>
-                <w:szCs w:val="18"/>
-              </w:rPr>
-              <w:t>ti</w:t>
-            </w:r>
-            <w:proofErr w:type="gramEnd"/>
-            <w:r>
-              <w:rPr>
-                <w:rFonts w:ascii="Consolas" w:hAnsi="Consolas"/>
-                <w:sz w:val="18"/>
-                <w:szCs w:val="18"/>
-              </w:rPr>
-              <w:t>,</w:t>
-            </w:r>
-            <w:proofErr w:type="gramStart"/>
-            <w:r>
-              <w:rPr>
-                <w:rFonts w:ascii="Consolas" w:hAnsi="Consolas"/>
-                <w:sz w:val="18"/>
-                <w:szCs w:val="18"/>
-              </w:rPr>
-              <w:t>ab,kf</w:t>
-            </w:r>
-            <w:proofErr w:type="spellEnd"/>
-            <w:proofErr w:type="gramEnd"/>
-            <w:r>
-              <w:rPr>
-                <w:rFonts w:ascii="Consolas" w:hAnsi="Consolas"/>
-                <w:sz w:val="18"/>
-                <w:szCs w:val="18"/>
-              </w:rPr>
-              <w:t>.</w:t>
+              <w:t>(mortality or cause of death or death certificat*).ti,ab,kf.</w:t>
             </w:r>
           </w:p>
         </w:tc>
@@ -1103,215 +868,7 @@
                 <w:sz w:val="18"/>
                 <w:szCs w:val="18"/>
               </w:rPr>
-              <w:t xml:space="preserve">(garbage code* or garbage cause* or garbage </w:t>
-            </w:r>
-            <w:proofErr w:type="spellStart"/>
-            <w:r>
-              <w:rPr>
-                <w:rFonts w:ascii="Consolas" w:hAnsi="Consolas"/>
-                <w:sz w:val="18"/>
-                <w:szCs w:val="18"/>
-              </w:rPr>
-              <w:t>categor</w:t>
-            </w:r>
-            <w:proofErr w:type="spellEnd"/>
-            <w:r>
-              <w:rPr>
-                <w:rFonts w:ascii="Consolas" w:hAnsi="Consolas"/>
-                <w:sz w:val="18"/>
-                <w:szCs w:val="18"/>
-              </w:rPr>
-              <w:t xml:space="preserve">* or garbage </w:t>
-            </w:r>
-            <w:proofErr w:type="spellStart"/>
-            <w:r>
-              <w:rPr>
-                <w:rFonts w:ascii="Consolas" w:hAnsi="Consolas"/>
-                <w:sz w:val="18"/>
-                <w:szCs w:val="18"/>
-              </w:rPr>
-              <w:t>diagnos</w:t>
-            </w:r>
-            <w:proofErr w:type="spellEnd"/>
-            <w:r>
-              <w:rPr>
-                <w:rFonts w:ascii="Consolas" w:hAnsi="Consolas"/>
-                <w:sz w:val="18"/>
-                <w:szCs w:val="18"/>
-              </w:rPr>
-              <w:t xml:space="preserve">* or ill-defined cause* or ill-defined death* or ill-defined condition* or poorly defined cause* or </w:t>
-            </w:r>
-            <w:proofErr w:type="spellStart"/>
-            <w:r>
-              <w:rPr>
-                <w:rFonts w:ascii="Consolas" w:hAnsi="Consolas"/>
-                <w:sz w:val="18"/>
-                <w:szCs w:val="18"/>
-              </w:rPr>
-              <w:t>causas</w:t>
-            </w:r>
-            <w:proofErr w:type="spellEnd"/>
-            <w:r>
-              <w:rPr>
-                <w:rFonts w:ascii="Consolas" w:hAnsi="Consolas"/>
-                <w:sz w:val="18"/>
-                <w:szCs w:val="18"/>
-              </w:rPr>
-              <w:t xml:space="preserve"> mal </w:t>
-            </w:r>
-            <w:proofErr w:type="spellStart"/>
-            <w:r>
-              <w:rPr>
-                <w:rFonts w:ascii="Consolas" w:hAnsi="Consolas"/>
-                <w:sz w:val="18"/>
-                <w:szCs w:val="18"/>
-              </w:rPr>
-              <w:t>definidas</w:t>
-            </w:r>
-            <w:proofErr w:type="spellEnd"/>
-            <w:r>
-              <w:rPr>
-                <w:rFonts w:ascii="Consolas" w:hAnsi="Consolas"/>
-                <w:sz w:val="18"/>
-                <w:szCs w:val="18"/>
-              </w:rPr>
-              <w:t xml:space="preserve"> or </w:t>
-            </w:r>
-            <w:proofErr w:type="spellStart"/>
-            <w:r>
-              <w:rPr>
-                <w:rFonts w:ascii="Consolas" w:hAnsi="Consolas"/>
-                <w:sz w:val="18"/>
-                <w:szCs w:val="18"/>
-              </w:rPr>
-              <w:t>codigos</w:t>
-            </w:r>
-            <w:proofErr w:type="spellEnd"/>
-            <w:r>
-              <w:rPr>
-                <w:rFonts w:ascii="Consolas" w:hAnsi="Consolas"/>
-                <w:sz w:val="18"/>
-                <w:szCs w:val="18"/>
-              </w:rPr>
-              <w:t xml:space="preserve"> </w:t>
-            </w:r>
-            <w:proofErr w:type="spellStart"/>
-            <w:r>
-              <w:rPr>
-                <w:rFonts w:ascii="Consolas" w:hAnsi="Consolas"/>
-                <w:sz w:val="18"/>
-                <w:szCs w:val="18"/>
-              </w:rPr>
-              <w:t>basura</w:t>
-            </w:r>
-            <w:proofErr w:type="spellEnd"/>
-            <w:r>
-              <w:rPr>
-                <w:rFonts w:ascii="Consolas" w:hAnsi="Consolas"/>
-                <w:sz w:val="18"/>
-                <w:szCs w:val="18"/>
-              </w:rPr>
-              <w:t xml:space="preserve"> or </w:t>
-            </w:r>
-            <w:proofErr w:type="spellStart"/>
-            <w:r>
-              <w:rPr>
-                <w:rFonts w:ascii="Consolas" w:hAnsi="Consolas"/>
-                <w:sz w:val="18"/>
-                <w:szCs w:val="18"/>
-              </w:rPr>
-              <w:t>codigos</w:t>
-            </w:r>
-            <w:proofErr w:type="spellEnd"/>
-            <w:r>
-              <w:rPr>
-                <w:rFonts w:ascii="Consolas" w:hAnsi="Consolas"/>
-                <w:sz w:val="18"/>
-                <w:szCs w:val="18"/>
-              </w:rPr>
-              <w:t xml:space="preserve"> </w:t>
-            </w:r>
-            <w:proofErr w:type="spellStart"/>
-            <w:r>
-              <w:rPr>
-                <w:rFonts w:ascii="Consolas" w:hAnsi="Consolas"/>
-                <w:sz w:val="18"/>
-                <w:szCs w:val="18"/>
-              </w:rPr>
-              <w:t>lixo</w:t>
-            </w:r>
-            <w:proofErr w:type="spellEnd"/>
-            <w:r>
-              <w:rPr>
-                <w:rFonts w:ascii="Consolas" w:hAnsi="Consolas"/>
-                <w:sz w:val="18"/>
-                <w:szCs w:val="18"/>
-              </w:rPr>
-              <w:t xml:space="preserve"> or </w:t>
-            </w:r>
-            <w:proofErr w:type="spellStart"/>
-            <w:r>
-              <w:rPr>
-                <w:rFonts w:ascii="Consolas" w:hAnsi="Consolas"/>
-                <w:sz w:val="18"/>
-                <w:szCs w:val="18"/>
-              </w:rPr>
-              <w:t>codigos</w:t>
-            </w:r>
-            <w:proofErr w:type="spellEnd"/>
-            <w:r>
-              <w:rPr>
-                <w:rFonts w:ascii="Consolas" w:hAnsi="Consolas"/>
-                <w:sz w:val="18"/>
-                <w:szCs w:val="18"/>
-              </w:rPr>
-              <w:t xml:space="preserve"> garbage or R00-R99</w:t>
-            </w:r>
-            <w:proofErr w:type="gramStart"/>
-            <w:r>
-              <w:rPr>
-                <w:rFonts w:ascii="Consolas" w:hAnsi="Consolas"/>
-                <w:sz w:val="18"/>
-                <w:szCs w:val="18"/>
-              </w:rPr>
-              <w:t>).</w:t>
-            </w:r>
-            <w:proofErr w:type="spellStart"/>
-            <w:r>
-              <w:rPr>
-                <w:rFonts w:ascii="Consolas" w:hAnsi="Consolas"/>
-                <w:sz w:val="18"/>
-                <w:szCs w:val="18"/>
-              </w:rPr>
-              <w:t>ti</w:t>
-            </w:r>
-            <w:proofErr w:type="gramEnd"/>
-            <w:r>
-              <w:rPr>
-                <w:rFonts w:ascii="Consolas" w:hAnsi="Consolas"/>
-                <w:sz w:val="18"/>
-                <w:szCs w:val="18"/>
-              </w:rPr>
-              <w:t>,</w:t>
-            </w:r>
-            <w:proofErr w:type="gramStart"/>
-            <w:r>
-              <w:rPr>
-                <w:rFonts w:ascii="Consolas" w:hAnsi="Consolas"/>
-                <w:sz w:val="18"/>
-                <w:szCs w:val="18"/>
-              </w:rPr>
-              <w:t>ab,kf</w:t>
-            </w:r>
-            <w:proofErr w:type="spellEnd"/>
-            <w:proofErr w:type="gramEnd"/>
-            <w:r>
-              <w:rPr>
-                <w:rFonts w:ascii="Consolas" w:hAnsi="Consolas"/>
-                <w:sz w:val="18"/>
-                <w:szCs w:val="18"/>
-              </w:rPr>
-              <w:t>.</w:t>
+              <w:t>(garbage code* or garbage cause* or garbage categor* or garbage diagnos* or ill-defined cause* or ill-defined death* or ill-defined condition* or poorly defined cause* or causas mal definidas or codigos basura or codigos lixo or codigos garbage or R00-R99).ti,ab,kf.</w:t>
             </w:r>
           </w:p>
         </w:tc>
@@ -1382,53 +939,7 @@
                 <w:sz w:val="18"/>
                 <w:szCs w:val="18"/>
               </w:rPr>
-              <w:t>(ill-defined or unknown cause* or unspecified cause* or nonspecific cause* or non-specific cause* or unspecific cause* or undetermined cause* or vague code* or cause of death assignment or underlying cause assignment</w:t>
-            </w:r>
-            <w:proofErr w:type="gramStart"/>
-            <w:r>
-              <w:rPr>
-                <w:rFonts w:ascii="Consolas" w:hAnsi="Consolas"/>
-                <w:sz w:val="18"/>
-                <w:szCs w:val="18"/>
-              </w:rPr>
-              <w:t>).</w:t>
-            </w:r>
-            <w:proofErr w:type="spellStart"/>
-            <w:r>
-              <w:rPr>
-                <w:rFonts w:ascii="Consolas" w:hAnsi="Consolas"/>
-                <w:sz w:val="18"/>
-                <w:szCs w:val="18"/>
-              </w:rPr>
-              <w:t>ti</w:t>
-            </w:r>
-            <w:proofErr w:type="gramEnd"/>
-            <w:r>
-              <w:rPr>
-                <w:rFonts w:ascii="Consolas" w:hAnsi="Consolas"/>
-                <w:sz w:val="18"/>
-                <w:szCs w:val="18"/>
-              </w:rPr>
-              <w:t>,</w:t>
-            </w:r>
-            <w:proofErr w:type="gramStart"/>
-            <w:r>
-              <w:rPr>
-                <w:rFonts w:ascii="Consolas" w:hAnsi="Consolas"/>
-                <w:sz w:val="18"/>
-                <w:szCs w:val="18"/>
-              </w:rPr>
-              <w:t>ab,kf</w:t>
-            </w:r>
-            <w:proofErr w:type="spellEnd"/>
-            <w:proofErr w:type="gramEnd"/>
-            <w:r>
-              <w:rPr>
-                <w:rFonts w:ascii="Consolas" w:hAnsi="Consolas"/>
-                <w:sz w:val="18"/>
-                <w:szCs w:val="18"/>
-              </w:rPr>
-              <w:t>.</w:t>
+              <w:t>(ill-defined or unknown cause* or unspecified cause* or nonspecific cause* or non-specific cause* or unspecific cause* or undetermined cause* or vague code* or cause of death assignment or underlying cause assignment).ti,ab,kf.</w:t>
             </w:r>
           </w:p>
         </w:tc>
@@ -1499,89 +1010,7 @@
                 <w:sz w:val="18"/>
                 <w:szCs w:val="18"/>
               </w:rPr>
-              <w:t xml:space="preserve">((ill-defined or ill defined or poorly defined or insufficiently defined or unspecified or unspecific or nonspecific or non-specific or unknown or undetermined or vague or imprecise) adj3 (cause* or death* or code* or coding or </w:t>
-            </w:r>
-            <w:proofErr w:type="spellStart"/>
-            <w:r>
-              <w:rPr>
-                <w:rFonts w:ascii="Consolas" w:hAnsi="Consolas"/>
-                <w:sz w:val="18"/>
-                <w:szCs w:val="18"/>
-              </w:rPr>
-              <w:t>categor</w:t>
-            </w:r>
-            <w:proofErr w:type="spellEnd"/>
-            <w:r>
-              <w:rPr>
-                <w:rFonts w:ascii="Consolas" w:hAnsi="Consolas"/>
-                <w:sz w:val="18"/>
-                <w:szCs w:val="18"/>
-              </w:rPr>
-              <w:t xml:space="preserve">* or </w:t>
-            </w:r>
-            <w:proofErr w:type="spellStart"/>
-            <w:r>
-              <w:rPr>
-                <w:rFonts w:ascii="Consolas" w:hAnsi="Consolas"/>
-                <w:sz w:val="18"/>
-                <w:szCs w:val="18"/>
-              </w:rPr>
-              <w:t>diagnos</w:t>
-            </w:r>
-            <w:proofErr w:type="spellEnd"/>
-            <w:r>
-              <w:rPr>
-                <w:rFonts w:ascii="Consolas" w:hAnsi="Consolas"/>
-                <w:sz w:val="18"/>
-                <w:szCs w:val="18"/>
-              </w:rPr>
-              <w:t>* or condition*)</w:t>
-            </w:r>
-            <w:proofErr w:type="gramStart"/>
-            <w:r>
-              <w:rPr>
-                <w:rFonts w:ascii="Consolas" w:hAnsi="Consolas"/>
-                <w:sz w:val="18"/>
-                <w:szCs w:val="18"/>
-              </w:rPr>
-              <w:t>).</w:t>
-            </w:r>
-            <w:proofErr w:type="spellStart"/>
-            <w:r>
-              <w:rPr>
-                <w:rFonts w:ascii="Consolas" w:hAnsi="Consolas"/>
-                <w:sz w:val="18"/>
-                <w:szCs w:val="18"/>
-              </w:rPr>
-              <w:t>ti</w:t>
-            </w:r>
-            <w:proofErr w:type="gramEnd"/>
-            <w:r>
-              <w:rPr>
-                <w:rFonts w:ascii="Consolas" w:hAnsi="Consolas"/>
-                <w:sz w:val="18"/>
-                <w:szCs w:val="18"/>
-              </w:rPr>
-              <w:t>,</w:t>
-            </w:r>
-            <w:proofErr w:type="gramStart"/>
-            <w:r>
-              <w:rPr>
-                <w:rFonts w:ascii="Consolas" w:hAnsi="Consolas"/>
-                <w:sz w:val="18"/>
-                <w:szCs w:val="18"/>
-              </w:rPr>
-              <w:t>ab,kf</w:t>
-            </w:r>
-            <w:proofErr w:type="spellEnd"/>
-            <w:proofErr w:type="gramEnd"/>
-            <w:r>
-              <w:rPr>
-                <w:rFonts w:ascii="Consolas" w:hAnsi="Consolas"/>
-                <w:sz w:val="18"/>
-                <w:szCs w:val="18"/>
-              </w:rPr>
-              <w:t>.</w:t>
+              <w:t>((ill-defined or ill defined or poorly defined or insufficiently defined or unspecified or unspecific or nonspecific or non-specific or unknown or undetermined or vague or imprecise) adj3 (cause* or death* or code* or coding or categor* or diagnos* or condition*)).ti,ab,kf.</w:t>
             </w:r>
           </w:p>
         </w:tc>
@@ -1652,161 +1081,7 @@
                 <w:sz w:val="18"/>
                 <w:szCs w:val="18"/>
               </w:rPr>
-              <w:t>((</w:t>
-            </w:r>
-            <w:proofErr w:type="spellStart"/>
-            <w:r>
-              <w:rPr>
-                <w:rFonts w:ascii="Consolas" w:hAnsi="Consolas"/>
-                <w:sz w:val="18"/>
-                <w:szCs w:val="18"/>
-              </w:rPr>
-              <w:t>misclassif</w:t>
-            </w:r>
-            <w:proofErr w:type="spellEnd"/>
-            <w:r>
-              <w:rPr>
-                <w:rFonts w:ascii="Consolas" w:hAnsi="Consolas"/>
-                <w:sz w:val="18"/>
-                <w:szCs w:val="18"/>
-              </w:rPr>
-              <w:t xml:space="preserve">* or </w:t>
-            </w:r>
-            <w:proofErr w:type="spellStart"/>
-            <w:r>
-              <w:rPr>
-                <w:rFonts w:ascii="Consolas" w:hAnsi="Consolas"/>
-                <w:sz w:val="18"/>
-                <w:szCs w:val="18"/>
-              </w:rPr>
-              <w:t>miscod</w:t>
-            </w:r>
-            <w:proofErr w:type="spellEnd"/>
-            <w:r>
-              <w:rPr>
-                <w:rFonts w:ascii="Consolas" w:hAnsi="Consolas"/>
-                <w:sz w:val="18"/>
-                <w:szCs w:val="18"/>
-              </w:rPr>
-              <w:t xml:space="preserve">* or </w:t>
-            </w:r>
-            <w:proofErr w:type="spellStart"/>
-            <w:r>
-              <w:rPr>
-                <w:rFonts w:ascii="Consolas" w:hAnsi="Consolas"/>
-                <w:sz w:val="18"/>
-                <w:szCs w:val="18"/>
-              </w:rPr>
-              <w:t>misattribut</w:t>
-            </w:r>
-            <w:proofErr w:type="spellEnd"/>
-            <w:r>
-              <w:rPr>
-                <w:rFonts w:ascii="Consolas" w:hAnsi="Consolas"/>
-                <w:sz w:val="18"/>
-                <w:szCs w:val="18"/>
-              </w:rPr>
-              <w:t xml:space="preserve">* or </w:t>
-            </w:r>
-            <w:proofErr w:type="spellStart"/>
-            <w:r>
-              <w:rPr>
-                <w:rFonts w:ascii="Consolas" w:hAnsi="Consolas"/>
-                <w:sz w:val="18"/>
-                <w:szCs w:val="18"/>
-              </w:rPr>
-              <w:t>miscertif</w:t>
-            </w:r>
-            <w:proofErr w:type="spellEnd"/>
-            <w:r>
-              <w:rPr>
-                <w:rFonts w:ascii="Consolas" w:hAnsi="Consolas"/>
-                <w:sz w:val="18"/>
-                <w:szCs w:val="18"/>
-              </w:rPr>
-              <w:t xml:space="preserve">*) adj3 (cause* or death* or code* or coding or </w:t>
-            </w:r>
-            <w:proofErr w:type="spellStart"/>
-            <w:r>
-              <w:rPr>
-                <w:rFonts w:ascii="Consolas" w:hAnsi="Consolas"/>
-                <w:sz w:val="18"/>
-                <w:szCs w:val="18"/>
-              </w:rPr>
-              <w:t>certificat</w:t>
-            </w:r>
-            <w:proofErr w:type="spellEnd"/>
-            <w:r>
-              <w:rPr>
-                <w:rFonts w:ascii="Consolas" w:hAnsi="Consolas"/>
-                <w:sz w:val="18"/>
-                <w:szCs w:val="18"/>
-              </w:rPr>
-              <w:t xml:space="preserve">* or </w:t>
-            </w:r>
-            <w:proofErr w:type="spellStart"/>
-            <w:r>
-              <w:rPr>
-                <w:rFonts w:ascii="Consolas" w:hAnsi="Consolas"/>
-                <w:sz w:val="18"/>
-                <w:szCs w:val="18"/>
-              </w:rPr>
-              <w:t>diagnos</w:t>
-            </w:r>
-            <w:proofErr w:type="spellEnd"/>
-            <w:r>
-              <w:rPr>
-                <w:rFonts w:ascii="Consolas" w:hAnsi="Consolas"/>
-                <w:sz w:val="18"/>
-                <w:szCs w:val="18"/>
-              </w:rPr>
-              <w:t>*)</w:t>
-            </w:r>
-            <w:proofErr w:type="gramStart"/>
-            <w:r>
-              <w:rPr>
-                <w:rFonts w:ascii="Consolas" w:hAnsi="Consolas"/>
-                <w:sz w:val="18"/>
-                <w:szCs w:val="18"/>
-              </w:rPr>
-              <w:t>).</w:t>
-            </w:r>
-            <w:proofErr w:type="spellStart"/>
-            <w:r>
-              <w:rPr>
-                <w:rFonts w:ascii="Consolas" w:hAnsi="Consolas"/>
-                <w:sz w:val="18"/>
-                <w:szCs w:val="18"/>
-              </w:rPr>
-              <w:t>ti</w:t>
-            </w:r>
-            <w:proofErr w:type="gramEnd"/>
-            <w:r>
-              <w:rPr>
-                <w:rFonts w:ascii="Consolas" w:hAnsi="Consolas"/>
-                <w:sz w:val="18"/>
-                <w:szCs w:val="18"/>
-              </w:rPr>
-              <w:t>,</w:t>
-            </w:r>
-            <w:proofErr w:type="gramStart"/>
-            <w:r>
-              <w:rPr>
-                <w:rFonts w:ascii="Consolas" w:hAnsi="Consolas"/>
-                <w:sz w:val="18"/>
-                <w:szCs w:val="18"/>
-              </w:rPr>
-              <w:t>ab,kf</w:t>
-            </w:r>
-            <w:proofErr w:type="spellEnd"/>
-            <w:proofErr w:type="gramEnd"/>
-            <w:r>
-              <w:rPr>
-                <w:rFonts w:ascii="Consolas" w:hAnsi="Consolas"/>
-                <w:sz w:val="18"/>
-                <w:szCs w:val="18"/>
-              </w:rPr>
-              <w:t>.</w:t>
+              <w:t>((misclassif* or miscod* or misattribut* or miscertif*) adj3 (cause* or death* or code* or coding or certificat* or diagnos*)).ti,ab,kf.</w:t>
             </w:r>
           </w:p>
         </w:tc>
@@ -2193,25 +1468,7 @@
                 <w:sz w:val="18"/>
                 <w:szCs w:val="18"/>
               </w:rPr>
-              <w:t xml:space="preserve">exp </w:t>
-            </w:r>
-            <w:proofErr w:type="spellStart"/>
-            <w:r>
-              <w:rPr>
-                <w:rFonts w:ascii="Consolas" w:hAnsi="Consolas"/>
-                <w:sz w:val="18"/>
-                <w:szCs w:val="18"/>
-              </w:rPr>
-              <w:t>Spatio</w:t>
-            </w:r>
-            <w:proofErr w:type="spellEnd"/>
-            <w:r>
-              <w:rPr>
-                <w:rFonts w:ascii="Consolas" w:hAnsi="Consolas"/>
-                <w:sz w:val="18"/>
-                <w:szCs w:val="18"/>
-              </w:rPr>
-              <w:t>-Temporal Analysis/</w:t>
+              <w:t>exp Spatio-Temporal Analysis/</w:t>
             </w:r>
           </w:p>
         </w:tc>
@@ -3063,79 +2320,7 @@
                 <w:sz w:val="18"/>
                 <w:szCs w:val="18"/>
               </w:rPr>
-              <w:t xml:space="preserve">(proportional redistribution or proportional distribution or fractional algorithm* or Brass technique or Brass technic or reverse survival or stable population or demographic </w:t>
-            </w:r>
-            <w:proofErr w:type="spellStart"/>
-            <w:r>
-              <w:rPr>
-                <w:rFonts w:ascii="Consolas" w:hAnsi="Consolas"/>
-                <w:sz w:val="18"/>
-                <w:szCs w:val="18"/>
-              </w:rPr>
-              <w:t>analys</w:t>
-            </w:r>
-            <w:proofErr w:type="spellEnd"/>
-            <w:r>
-              <w:rPr>
-                <w:rFonts w:ascii="Consolas" w:hAnsi="Consolas"/>
-                <w:sz w:val="18"/>
-                <w:szCs w:val="18"/>
-              </w:rPr>
-              <w:t xml:space="preserve">* or life table* or statistical model* or probabilistic model* or </w:t>
-            </w:r>
-            <w:proofErr w:type="spellStart"/>
-            <w:r>
-              <w:rPr>
-                <w:rFonts w:ascii="Consolas" w:hAnsi="Consolas"/>
-                <w:sz w:val="18"/>
-                <w:szCs w:val="18"/>
-              </w:rPr>
-              <w:t>bayesian</w:t>
-            </w:r>
-            <w:proofErr w:type="spellEnd"/>
-            <w:r>
-              <w:rPr>
-                <w:rFonts w:ascii="Consolas" w:hAnsi="Consolas"/>
-                <w:sz w:val="18"/>
-                <w:szCs w:val="18"/>
-              </w:rPr>
-              <w:t xml:space="preserve"> or empirical bayes or spatiotemporal or </w:t>
-            </w:r>
-            <w:proofErr w:type="spellStart"/>
-            <w:r>
-              <w:rPr>
-                <w:rFonts w:ascii="Consolas" w:hAnsi="Consolas"/>
-                <w:sz w:val="18"/>
-                <w:szCs w:val="18"/>
-              </w:rPr>
-              <w:t>spatio</w:t>
-            </w:r>
-            <w:proofErr w:type="spellEnd"/>
-            <w:r>
-              <w:rPr>
-                <w:rFonts w:ascii="Consolas" w:hAnsi="Consolas"/>
-                <w:sz w:val="18"/>
-                <w:szCs w:val="18"/>
-              </w:rPr>
-              <w:t xml:space="preserve">-temporal or spatial regression or </w:t>
-            </w:r>
-            <w:proofErr w:type="spellStart"/>
-            <w:r>
-              <w:rPr>
-                <w:rFonts w:ascii="Consolas" w:hAnsi="Consolas"/>
-                <w:sz w:val="18"/>
-                <w:szCs w:val="18"/>
-              </w:rPr>
-              <w:t>imput</w:t>
-            </w:r>
-            <w:proofErr w:type="spellEnd"/>
-            <w:r>
-              <w:rPr>
-                <w:rFonts w:ascii="Consolas" w:hAnsi="Consolas"/>
-                <w:sz w:val="18"/>
-                <w:szCs w:val="18"/>
-              </w:rPr>
-              <w:t xml:space="preserve">* or </w:t>
+              <w:t xml:space="preserve">(proportional redistribution or proportional distribution or fractional algorithm* or Brass technique or Brass technic or reverse survival or stable population or demographic analys* or life table* or statistical model* or probabilistic model* or bayesian or empirical bayes or spatiotemporal or spatio-temporal or spatial regression or imput* or </w:t>
             </w:r>
             <w:r>
               <w:rPr>
@@ -3144,71 +2329,7 @@
                 <w:szCs w:val="18"/>
               </w:rPr>
               <w:lastRenderedPageBreak/>
-              <w:t xml:space="preserve">CODEm or </w:t>
-            </w:r>
-            <w:proofErr w:type="spellStart"/>
-            <w:r>
-              <w:rPr>
-                <w:rFonts w:ascii="Consolas" w:hAnsi="Consolas"/>
-                <w:sz w:val="18"/>
-                <w:szCs w:val="18"/>
-              </w:rPr>
-              <w:t>CoDCorrect</w:t>
-            </w:r>
-            <w:proofErr w:type="spellEnd"/>
-            <w:r>
-              <w:rPr>
-                <w:rFonts w:ascii="Consolas" w:hAnsi="Consolas"/>
-                <w:sz w:val="18"/>
-                <w:szCs w:val="18"/>
-              </w:rPr>
-              <w:t xml:space="preserve"> or cause of death ensemble model* or coarsened exact matching</w:t>
-            </w:r>
-            <w:proofErr w:type="gramStart"/>
-            <w:r>
-              <w:rPr>
-                <w:rFonts w:ascii="Consolas" w:hAnsi="Consolas"/>
-                <w:sz w:val="18"/>
-                <w:szCs w:val="18"/>
-              </w:rPr>
-              <w:t>).</w:t>
-            </w:r>
-            <w:proofErr w:type="spellStart"/>
-            <w:r>
-              <w:rPr>
-                <w:rFonts w:ascii="Consolas" w:hAnsi="Consolas"/>
-                <w:sz w:val="18"/>
-                <w:szCs w:val="18"/>
-              </w:rPr>
-              <w:t>ti</w:t>
-            </w:r>
-            <w:proofErr w:type="gramEnd"/>
-            <w:r>
-              <w:rPr>
-                <w:rFonts w:ascii="Consolas" w:hAnsi="Consolas"/>
-                <w:sz w:val="18"/>
-                <w:szCs w:val="18"/>
-              </w:rPr>
-              <w:t>,</w:t>
-            </w:r>
-            <w:proofErr w:type="gramStart"/>
-            <w:r>
-              <w:rPr>
-                <w:rFonts w:ascii="Consolas" w:hAnsi="Consolas"/>
-                <w:sz w:val="18"/>
-                <w:szCs w:val="18"/>
-              </w:rPr>
-              <w:t>ab,kf</w:t>
-            </w:r>
-            <w:proofErr w:type="spellEnd"/>
-            <w:proofErr w:type="gramEnd"/>
-            <w:r>
-              <w:rPr>
-                <w:rFonts w:ascii="Consolas" w:hAnsi="Consolas"/>
-                <w:sz w:val="18"/>
-                <w:szCs w:val="18"/>
-              </w:rPr>
-              <w:t>.</w:t>
+              <w:t>CODEm or CoDCorrect or cause of death ensemble model* or coarsened exact matching).ti,ab,kf.</w:t>
             </w:r>
           </w:p>
         </w:tc>
@@ -3280,89 +2401,7 @@
                 <w:sz w:val="18"/>
                 <w:szCs w:val="18"/>
               </w:rPr>
-              <w:t>(</w:t>
-            </w:r>
-            <w:proofErr w:type="spellStart"/>
-            <w:r>
-              <w:rPr>
-                <w:rFonts w:ascii="Consolas" w:hAnsi="Consolas"/>
-                <w:sz w:val="18"/>
-                <w:szCs w:val="18"/>
-              </w:rPr>
-              <w:t>reallocat</w:t>
-            </w:r>
-            <w:proofErr w:type="spellEnd"/>
-            <w:r>
-              <w:rPr>
-                <w:rFonts w:ascii="Consolas" w:hAnsi="Consolas"/>
-                <w:sz w:val="18"/>
-                <w:szCs w:val="18"/>
-              </w:rPr>
-              <w:t xml:space="preserve">* or reassign* or </w:t>
-            </w:r>
-            <w:proofErr w:type="spellStart"/>
-            <w:r>
-              <w:rPr>
-                <w:rFonts w:ascii="Consolas" w:hAnsi="Consolas"/>
-                <w:sz w:val="18"/>
-                <w:szCs w:val="18"/>
-              </w:rPr>
-              <w:t>recod</w:t>
-            </w:r>
-            <w:proofErr w:type="spellEnd"/>
-            <w:r>
-              <w:rPr>
-                <w:rFonts w:ascii="Consolas" w:hAnsi="Consolas"/>
-                <w:sz w:val="18"/>
-                <w:szCs w:val="18"/>
-              </w:rPr>
-              <w:t>* or algorithm* or multiple cause* or linkage</w:t>
-            </w:r>
-            <w:proofErr w:type="gramStart"/>
-            <w:r>
-              <w:rPr>
-                <w:rFonts w:ascii="Consolas" w:hAnsi="Consolas"/>
-                <w:sz w:val="18"/>
-                <w:szCs w:val="18"/>
-              </w:rPr>
-              <w:t>).</w:t>
-            </w:r>
-            <w:proofErr w:type="spellStart"/>
-            <w:r>
-              <w:rPr>
-                <w:rFonts w:ascii="Consolas" w:hAnsi="Consolas"/>
-                <w:sz w:val="18"/>
-                <w:szCs w:val="18"/>
-              </w:rPr>
-              <w:t>ti</w:t>
-            </w:r>
-            <w:proofErr w:type="gramEnd"/>
-            <w:r>
-              <w:rPr>
-                <w:rFonts w:ascii="Consolas" w:hAnsi="Consolas"/>
-                <w:sz w:val="18"/>
-                <w:szCs w:val="18"/>
-              </w:rPr>
-              <w:t>,</w:t>
-            </w:r>
-            <w:proofErr w:type="gramStart"/>
-            <w:r>
-              <w:rPr>
-                <w:rFonts w:ascii="Consolas" w:hAnsi="Consolas"/>
-                <w:sz w:val="18"/>
-                <w:szCs w:val="18"/>
-              </w:rPr>
-              <w:t>ab,kf</w:t>
-            </w:r>
-            <w:proofErr w:type="spellEnd"/>
-            <w:proofErr w:type="gramEnd"/>
-            <w:r>
-              <w:rPr>
-                <w:rFonts w:ascii="Consolas" w:hAnsi="Consolas"/>
-                <w:sz w:val="18"/>
-                <w:szCs w:val="18"/>
-              </w:rPr>
-              <w:t>.</w:t>
+              <w:t>(reallocat* or reassign* or recod* or algorithm* or multiple cause* or linkage).ti,ab,kf.</w:t>
             </w:r>
           </w:p>
         </w:tc>
@@ -3433,71 +2472,7 @@
                 <w:sz w:val="18"/>
                 <w:szCs w:val="18"/>
               </w:rPr>
-              <w:t xml:space="preserve">(verbal </w:t>
-            </w:r>
-            <w:proofErr w:type="spellStart"/>
-            <w:r>
-              <w:rPr>
-                <w:rFonts w:ascii="Consolas" w:hAnsi="Consolas"/>
-                <w:sz w:val="18"/>
-                <w:szCs w:val="18"/>
-              </w:rPr>
-              <w:t>autops</w:t>
-            </w:r>
-            <w:proofErr w:type="spellEnd"/>
-            <w:r>
-              <w:rPr>
-                <w:rFonts w:ascii="Consolas" w:hAnsi="Consolas"/>
-                <w:sz w:val="18"/>
-                <w:szCs w:val="18"/>
-              </w:rPr>
-              <w:t>* or hospital discharge or discharge record* or discharge data or artificial intelligence or machine learning or decision tree* or data mining or random forest* or gradient boosting or deep learning or neural network*</w:t>
-            </w:r>
-            <w:proofErr w:type="gramStart"/>
-            <w:r>
-              <w:rPr>
-                <w:rFonts w:ascii="Consolas" w:hAnsi="Consolas"/>
-                <w:sz w:val="18"/>
-                <w:szCs w:val="18"/>
-              </w:rPr>
-              <w:t>).</w:t>
-            </w:r>
-            <w:proofErr w:type="spellStart"/>
-            <w:r>
-              <w:rPr>
-                <w:rFonts w:ascii="Consolas" w:hAnsi="Consolas"/>
-                <w:sz w:val="18"/>
-                <w:szCs w:val="18"/>
-              </w:rPr>
-              <w:t>ti</w:t>
-            </w:r>
-            <w:proofErr w:type="gramEnd"/>
-            <w:r>
-              <w:rPr>
-                <w:rFonts w:ascii="Consolas" w:hAnsi="Consolas"/>
-                <w:sz w:val="18"/>
-                <w:szCs w:val="18"/>
-              </w:rPr>
-              <w:t>,</w:t>
-            </w:r>
-            <w:proofErr w:type="gramStart"/>
-            <w:r>
-              <w:rPr>
-                <w:rFonts w:ascii="Consolas" w:hAnsi="Consolas"/>
-                <w:sz w:val="18"/>
-                <w:szCs w:val="18"/>
-              </w:rPr>
-              <w:t>ab,kf</w:t>
-            </w:r>
-            <w:proofErr w:type="spellEnd"/>
-            <w:proofErr w:type="gramEnd"/>
-            <w:r>
-              <w:rPr>
-                <w:rFonts w:ascii="Consolas" w:hAnsi="Consolas"/>
-                <w:sz w:val="18"/>
-                <w:szCs w:val="18"/>
-              </w:rPr>
-              <w:t>.</w:t>
+              <w:t>(verbal autops* or hospital discharge or discharge record* or discharge data or artificial intelligence or machine learning or decision tree* or data mining or random forest* or gradient boosting or deep learning or neural network*).ti,ab,kf.</w:t>
             </w:r>
           </w:p>
         </w:tc>
@@ -3568,71 +2543,7 @@
                 <w:sz w:val="18"/>
                 <w:szCs w:val="18"/>
               </w:rPr>
-              <w:t>(</w:t>
-            </w:r>
-            <w:proofErr w:type="spellStart"/>
-            <w:r>
-              <w:rPr>
-                <w:rFonts w:ascii="Consolas" w:hAnsi="Consolas"/>
-                <w:sz w:val="18"/>
-                <w:szCs w:val="18"/>
-              </w:rPr>
-              <w:t>microsimulat</w:t>
-            </w:r>
-            <w:proofErr w:type="spellEnd"/>
-            <w:r>
-              <w:rPr>
-                <w:rFonts w:ascii="Consolas" w:hAnsi="Consolas"/>
-                <w:sz w:val="18"/>
-                <w:szCs w:val="18"/>
-              </w:rPr>
-              <w:t>* or micro-simulation* or agent-based or synthetic population*</w:t>
-            </w:r>
-            <w:proofErr w:type="gramStart"/>
-            <w:r>
-              <w:rPr>
-                <w:rFonts w:ascii="Consolas" w:hAnsi="Consolas"/>
-                <w:sz w:val="18"/>
-                <w:szCs w:val="18"/>
-              </w:rPr>
-              <w:t>).</w:t>
-            </w:r>
-            <w:proofErr w:type="spellStart"/>
-            <w:r>
-              <w:rPr>
-                <w:rFonts w:ascii="Consolas" w:hAnsi="Consolas"/>
-                <w:sz w:val="18"/>
-                <w:szCs w:val="18"/>
-              </w:rPr>
-              <w:t>ti</w:t>
-            </w:r>
-            <w:proofErr w:type="gramEnd"/>
-            <w:r>
-              <w:rPr>
-                <w:rFonts w:ascii="Consolas" w:hAnsi="Consolas"/>
-                <w:sz w:val="18"/>
-                <w:szCs w:val="18"/>
-              </w:rPr>
-              <w:t>,</w:t>
-            </w:r>
-            <w:proofErr w:type="gramStart"/>
-            <w:r>
-              <w:rPr>
-                <w:rFonts w:ascii="Consolas" w:hAnsi="Consolas"/>
-                <w:sz w:val="18"/>
-                <w:szCs w:val="18"/>
-              </w:rPr>
-              <w:t>ab,kf</w:t>
-            </w:r>
-            <w:proofErr w:type="spellEnd"/>
-            <w:proofErr w:type="gramEnd"/>
-            <w:r>
-              <w:rPr>
-                <w:rFonts w:ascii="Consolas" w:hAnsi="Consolas"/>
-                <w:sz w:val="18"/>
-                <w:szCs w:val="18"/>
-              </w:rPr>
-              <w:t>.</w:t>
+              <w:t>(microsimulat* or micro-simulation* or agent-based or synthetic population*).ti,ab,kf.</w:t>
             </w:r>
           </w:p>
         </w:tc>
@@ -3703,107 +2614,7 @@
                 <w:sz w:val="18"/>
                 <w:szCs w:val="18"/>
               </w:rPr>
-              <w:t xml:space="preserve">(global burden of disease or GBD or </w:t>
-            </w:r>
-            <w:proofErr w:type="spellStart"/>
-            <w:r>
-              <w:rPr>
-                <w:rFonts w:ascii="Consolas" w:hAnsi="Consolas"/>
-                <w:sz w:val="18"/>
-                <w:szCs w:val="18"/>
-              </w:rPr>
-              <w:t>InterVA</w:t>
-            </w:r>
-            <w:proofErr w:type="spellEnd"/>
-            <w:r>
-              <w:rPr>
-                <w:rFonts w:ascii="Consolas" w:hAnsi="Consolas"/>
-                <w:sz w:val="18"/>
-                <w:szCs w:val="18"/>
-              </w:rPr>
-              <w:t xml:space="preserve"> or </w:t>
-            </w:r>
-            <w:proofErr w:type="spellStart"/>
-            <w:r>
-              <w:rPr>
-                <w:rFonts w:ascii="Consolas" w:hAnsi="Consolas"/>
-                <w:sz w:val="18"/>
-                <w:szCs w:val="18"/>
-              </w:rPr>
-              <w:t>InSilicoVA</w:t>
-            </w:r>
-            <w:proofErr w:type="spellEnd"/>
-            <w:r>
-              <w:rPr>
-                <w:rFonts w:ascii="Consolas" w:hAnsi="Consolas"/>
-                <w:sz w:val="18"/>
-                <w:szCs w:val="18"/>
-              </w:rPr>
-              <w:t xml:space="preserve"> or </w:t>
-            </w:r>
-            <w:proofErr w:type="spellStart"/>
-            <w:r>
-              <w:rPr>
-                <w:rFonts w:ascii="Consolas" w:hAnsi="Consolas"/>
-                <w:sz w:val="18"/>
-                <w:szCs w:val="18"/>
-              </w:rPr>
-              <w:t>SmartVA</w:t>
-            </w:r>
-            <w:proofErr w:type="spellEnd"/>
-            <w:r>
-              <w:rPr>
-                <w:rFonts w:ascii="Consolas" w:hAnsi="Consolas"/>
-                <w:sz w:val="18"/>
-                <w:szCs w:val="18"/>
-              </w:rPr>
-              <w:t xml:space="preserve"> or tariff method or bridge coding or comparability ratio* or IRIS software or automated coding or automated classification or small area estimation or correction factor*</w:t>
-            </w:r>
-            <w:proofErr w:type="gramStart"/>
-            <w:r>
-              <w:rPr>
-                <w:rFonts w:ascii="Consolas" w:hAnsi="Consolas"/>
-                <w:sz w:val="18"/>
-                <w:szCs w:val="18"/>
-              </w:rPr>
-              <w:t>).</w:t>
-            </w:r>
-            <w:proofErr w:type="spellStart"/>
-            <w:r>
-              <w:rPr>
-                <w:rFonts w:ascii="Consolas" w:hAnsi="Consolas"/>
-                <w:sz w:val="18"/>
-                <w:szCs w:val="18"/>
-              </w:rPr>
-              <w:t>ti</w:t>
-            </w:r>
-            <w:proofErr w:type="gramEnd"/>
-            <w:r>
-              <w:rPr>
-                <w:rFonts w:ascii="Consolas" w:hAnsi="Consolas"/>
-                <w:sz w:val="18"/>
-                <w:szCs w:val="18"/>
-              </w:rPr>
-              <w:t>,</w:t>
-            </w:r>
-            <w:proofErr w:type="gramStart"/>
-            <w:r>
-              <w:rPr>
-                <w:rFonts w:ascii="Consolas" w:hAnsi="Consolas"/>
-                <w:sz w:val="18"/>
-                <w:szCs w:val="18"/>
-              </w:rPr>
-              <w:t>ab,kf</w:t>
-            </w:r>
-            <w:proofErr w:type="spellEnd"/>
-            <w:proofErr w:type="gramEnd"/>
-            <w:r>
-              <w:rPr>
-                <w:rFonts w:ascii="Consolas" w:hAnsi="Consolas"/>
-                <w:sz w:val="18"/>
-                <w:szCs w:val="18"/>
-              </w:rPr>
-              <w:t>.</w:t>
+              <w:t>(global burden of disease or GBD or InterVA or InSilicoVA or SmartVA or tariff method or bridge coding or comparability ratio* or IRIS software or automated coding or automated classification or small area estimation or correction factor*).ti,ab,kf.</w:t>
             </w:r>
           </w:p>
         </w:tc>
@@ -3945,89 +2756,7 @@
                 <w:sz w:val="18"/>
                 <w:szCs w:val="18"/>
               </w:rPr>
-              <w:t>(</w:t>
-            </w:r>
-            <w:proofErr w:type="spellStart"/>
-            <w:r>
-              <w:rPr>
-                <w:rFonts w:ascii="Consolas" w:hAnsi="Consolas"/>
-                <w:sz w:val="18"/>
-                <w:szCs w:val="18"/>
-              </w:rPr>
-              <w:t>redistribut</w:t>
-            </w:r>
-            <w:proofErr w:type="spellEnd"/>
-            <w:r>
-              <w:rPr>
-                <w:rFonts w:ascii="Consolas" w:hAnsi="Consolas"/>
-                <w:sz w:val="18"/>
-                <w:szCs w:val="18"/>
-              </w:rPr>
-              <w:t xml:space="preserve">* or </w:t>
-            </w:r>
-            <w:proofErr w:type="spellStart"/>
-            <w:r>
-              <w:rPr>
-                <w:rFonts w:ascii="Consolas" w:hAnsi="Consolas"/>
-                <w:sz w:val="18"/>
-                <w:szCs w:val="18"/>
-              </w:rPr>
-              <w:t>reclassif</w:t>
-            </w:r>
-            <w:proofErr w:type="spellEnd"/>
-            <w:r>
-              <w:rPr>
-                <w:rFonts w:ascii="Consolas" w:hAnsi="Consolas"/>
-                <w:sz w:val="18"/>
-                <w:szCs w:val="18"/>
-              </w:rPr>
-              <w:t>*</w:t>
-            </w:r>
-            <w:proofErr w:type="gramStart"/>
-            <w:r>
-              <w:rPr>
-                <w:rFonts w:ascii="Consolas" w:hAnsi="Consolas"/>
-                <w:sz w:val="18"/>
-                <w:szCs w:val="18"/>
-              </w:rPr>
-              <w:t>).</w:t>
-            </w:r>
-            <w:proofErr w:type="spellStart"/>
-            <w:r>
-              <w:rPr>
-                <w:rFonts w:ascii="Consolas" w:hAnsi="Consolas"/>
-                <w:sz w:val="18"/>
-                <w:szCs w:val="18"/>
-              </w:rPr>
-              <w:t>ti</w:t>
-            </w:r>
-            <w:proofErr w:type="gramEnd"/>
-            <w:r>
-              <w:rPr>
-                <w:rFonts w:ascii="Consolas" w:hAnsi="Consolas"/>
-                <w:sz w:val="18"/>
-                <w:szCs w:val="18"/>
-              </w:rPr>
-              <w:t>,</w:t>
-            </w:r>
-            <w:proofErr w:type="gramStart"/>
-            <w:r>
-              <w:rPr>
-                <w:rFonts w:ascii="Consolas" w:hAnsi="Consolas"/>
-                <w:sz w:val="18"/>
-                <w:szCs w:val="18"/>
-              </w:rPr>
-              <w:t>ab,kf</w:t>
-            </w:r>
-            <w:proofErr w:type="spellEnd"/>
-            <w:proofErr w:type="gramEnd"/>
-            <w:r>
-              <w:rPr>
-                <w:rFonts w:ascii="Consolas" w:hAnsi="Consolas"/>
-                <w:sz w:val="18"/>
-                <w:szCs w:val="18"/>
-              </w:rPr>
-              <w:t>.</w:t>
+              <w:t>(redistribut* or reclassif*).ti,ab,kf.</w:t>
             </w:r>
           </w:p>
         </w:tc>

</xml_diff>